<commit_message>
Mo rong kiem chung: 4 ho mo hinh (them MLP), baseline quy tac Altman, walk-forward + cluster bootstrap, PORT ETL prepare_sec (5308/5312 o = 99.92%), nhan su kien 8-K, CI workflow; chay lai 22 buoc (234 test OK, 98200 audit 0 phat hien)
</commit_message>
<xml_diff>
--- a/docs/BAO-CAO-slide-bao-ve.docx
+++ b/docs/BAO-CAO-slide-bao-ve.docx
@@ -73,7 +73,7 @@
         <w:pStyle w:val="ListBullet"/>
       </w:pPr>
       <w:r>
-        <w:t>Tái lập 1 lệnh · 222 test · 98.200 phép kiểm tra, 0 phát hiện</w:t>
+        <w:t>Tái lập 1 lệnh · 234 test · 98.200+ phép kiểm tra, 0 phát hiện</w:t>
       </w:r>
     </w:p>
     <w:p>
@@ -360,7 +360,7 @@
         <w:pStyle w:val="Heading2"/>
       </w:pPr>
       <w:r>
-        <w:t>6. Ba họ mô hình và cách chọn</w:t>
+        <w:t>6. Bốn họ mô hình và cách chọn</w:t>
       </w:r>
     </w:p>
     <w:p>
@@ -368,7 +368,23 @@
         <w:pStyle w:val="ListBullet"/>
       </w:pPr>
       <w:r>
-        <w:t>Logistic Regression · Random Forest · HistGradientBoosting (3 họ, thuần scikit-learn)</w:t>
+        <w:t>Logistic Regression · Random Forest · HistGradientBoosting · MLP (4 họ, thuần scikit-learn)</w:t>
+      </w:r>
+    </w:p>
+    <w:p>
+      <w:pPr>
+        <w:pStyle w:val="ListBullet"/>
+      </w:pPr>
+      <w:r>
+        <w:t>Baseline quy tắc Altman Z'' &lt; 1,1 (không học tham số) + ticker-prior + dummy + 1 chỉ tiêu</w:t>
+      </w:r>
+    </w:p>
+    <w:p>
+      <w:pPr>
+        <w:pStyle w:val="ListBullet"/>
+      </w:pPr>
+      <w:r>
+        <w:t>Kiểm chứng 3 góc: in-domain · cross-company (GroupKFold/LOCO) · walk-forward theo thời gian</w:t>
       </w:r>
     </w:p>
     <w:p>
@@ -400,7 +416,7 @@
         <w:pStyle w:val="ListBullet"/>
       </w:pPr>
       <w:r>
-        <w:t>Random search + sổ thực nghiệm runs.csv (113 dòng)</w:t>
+        <w:t>Random search + sổ thực nghiệm runs.csv (153 dòng, 4 họ mô hình)</w:t>
       </w:r>
     </w:p>
     <w:p>
@@ -408,7 +424,7 @@
         <w:pStyle w:val="ListBullet"/>
       </w:pPr>
       <w:r>
-        <w:t>Chỉ 3 họ mô hình (không xgboost/lightgbm) ⇒ mọi báo cáo/slide lấy từ 1 registry</w:t>
+        <w:t>Chỉ 4 họ mô hình (không xgboost/lightgbm) ⇒ mọi báo cáo/slide lấy từ 1 registry</w:t>
       </w:r>
     </w:p>
     <w:p>
@@ -784,7 +800,7 @@
         <w:pStyle w:val="ListBullet"/>
       </w:pPr>
       <w:r>
-        <w:t>222 test tự động · audit 98.200 phép kiểm tra, 0 phát hiện</w:t>
+        <w:t>234 test tự động · audit 98.200+ phép kiểm tra, 0 phát hiện</w:t>
       </w:r>
     </w:p>
     <w:p>

</xml_diff>